<commit_message>
MC 451 Codebook trim: codebook 800-1,500 words, memo 200-300 unchanged
Owner q-20261021-0015 = A.
- Assignment page Length line: codebook 800 to 1,500 words, counting its variable and
  example tables (the template puts every variable in a table).
- Rubric PDF rebuilt: new Length line, due Friday, October 30 (it still said
  October 23), effort = two-thirds of the new minimum. Rows unchanged. PDF/UA-1 PASS.
- Worked example cut to fit, no new claims: codebook 1,413 words (1,447 counting
  headings), memo 289; two edge rules per variable, two examples per category, three
  whole-codebook rules, single-coder note in its three paragraphs; the memo's
  category trace still holds. PDF/UA-1 PASS.
- VR codebook example (MC 451): codebook trimmed to 1,467 words counting its In
  practice panels.
- S18 Before Next Time: the new codebook and memo ranges under the October 30 line.

Co-Authored-By: Claude Opus 5.5 <noreply@anthropic.com>
</commit_message>
<xml_diff>
--- a/examples/vr-codebook/files/MC451-vr-codebook-example.docx
+++ b/examples/vr-codebook/files/MC451-vr-codebook-example.docx
@@ -134,7 +134,7 @@
         <w:t xml:space="preserve">one Steam store page for one title</w:t>
       </w:r>
       <w:r>
-        <w:t xml:space="preserve">, as a buyer sees it: the short description, every screenshot, and every trailer. Reviews, forums, the long description below the media, and the game itself are not part of the item. Nothing is coded from playing the title.</w:t>
+        <w:t xml:space="preserve">, as a buyer sees it: the short description, every screenshot, and every trailer. Reviews, forums, the long description below the media, and the game itself are not part of the item.</w:t>
       </w:r>
     </w:p>
     <w:p>
@@ -359,7 +359,7 @@
               <w:jc w:val="left"/>
             </w:pPr>
             <w:r>
-              <w:t xml:space="preserve">Read the short description, then view every screenshot and trailer from left to right. Look for hands, controllers, tools, or weapons that the user moves, or for objects that respond to the user.</w:t>
+              <w:t xml:space="preserve">Read the short description and view every screenshot and trailer. Look for hands, controllers, tools, or weapons the user moves, or objects that respond to the user.</w:t>
             </w:r>
           </w:p>
         </w:tc>
@@ -385,7 +385,7 @@
               <w:jc w:val="left"/>
             </w:pPr>
             <w:r>
-              <w:t xml:space="preserve">Nominal. It allows counts, percentages, and a chi-square test against another nominal variable; it rules out a mean or a ranking.</w:t>
+              <w:t xml:space="preserve">Nominal. It allows counts, percentages, and a chi-square test; it rules out a mean or a ranking.</w:t>
             </w:r>
           </w:p>
         </w:tc>
@@ -476,7 +476,7 @@
               <w:jc w:val="left"/>
             </w:pPr>
             <w:r>
-              <w:t xml:space="preserve">I1. If hands appear but only point at a menu, code</w:t>
+              <w:t xml:space="preserve">I1. Hands that only point at a menu are</w:t>
             </w:r>
             <w:r>
               <w:t xml:space="preserve"> </w:t>
@@ -488,7 +488,7 @@
               <w:t xml:space="preserve">no</w:t>
             </w:r>
             <w:r>
-              <w:t xml:space="preserve">: a menu is not the environment. I2. If the description says the title is interactive but no screenshot or trailer shows it, code</w:t>
+              <w:t xml:space="preserve">. I2. If only the description claims interactivity, code</w:t>
             </w:r>
             <w:r>
               <w:t xml:space="preserve"> </w:t>
@@ -553,7 +553,7 @@
               <w:t xml:space="preserve"> </w:t>
             </w:r>
             <w:r>
-              <w:t xml:space="preserve">turned out to need controllers to play, this variable would be measuring how a page is marketed rather than what the experience offers.</w:t>
+              <w:t xml:space="preserve">turned out to need controllers, this variable would measure marketing, not the experience.</w:t>
             </w:r>
           </w:p>
         </w:tc>
@@ -665,7 +665,7 @@
               <w:jc w:val="left"/>
             </w:pPr>
             <w:r>
-              <w:t xml:space="preserve">In the screenshots and trailers, check where the camera sits and whether a main character is seen from outside.</w:t>
+              <w:t xml:space="preserve">Check where the camera sits and whether a main character is seen from outside.</w:t>
             </w:r>
           </w:p>
         </w:tc>
@@ -782,7 +782,7 @@
               <w:jc w:val="left"/>
             </w:pPr>
             <w:r>
-              <w:t xml:space="preserve">P1. If the page shows both views, code the view in most of the screenshots and trailers, and write a note. P2. If there is no camera position at all (a menu tool or a video player), code</w:t>
+              <w:t xml:space="preserve">P1. If the page shows both views, code the majority view and write a note. P2. If there is no camera position at all (a menu tool or a video player), code</w:t>
             </w:r>
             <w:r>
               <w:t xml:space="preserve"> </w:t>
@@ -998,7 +998,7 @@
               <w:jc w:val="left"/>
             </w:pPr>
             <w:r>
-              <w:t xml:space="preserve">For each genre, judge whether its activity fills more than 20 percent of what the page shows, counting the screenshots and the trailer time that show it. Use the definitions in the table below.</w:t>
+              <w:t xml:space="preserve">For each genre, judge whether its activity fills more than 20 percent of the screenshots and trailer time. Use the definitions below.</w:t>
             </w:r>
           </w:p>
         </w:tc>
@@ -1024,7 +1024,7 @@
               <w:jc w:val="left"/>
             </w:pPr>
             <w:r>
-              <w:t xml:space="preserve">Nominal, one per genre. Counts and percentages per genre, and comparisons between groups of titles; it rules out adding genres into a score.</w:t>
+              <w:t xml:space="preserve">Nominal, one per genre. Counts, percentages, and group comparisons; it rules out adding genres into a score.</w:t>
             </w:r>
           </w:p>
         </w:tc>
@@ -1329,7 +1329,7 @@
               <w:jc w:val="left"/>
             </w:pPr>
             <w:r>
-              <w:t xml:space="preserve">The experience relies on the player’s reflexes, coordination, or reaction time.</w:t>
+              <w:t xml:space="preserve">Play relies on reflexes, coordination, or reaction time.</w:t>
             </w:r>
           </w:p>
         </w:tc>
@@ -1459,7 +1459,7 @@
               <w:jc w:val="left"/>
             </w:pPr>
             <w:r>
-              <w:t xml:space="preserve">The experience centers on hand-to-hand or melee combat.</w:t>
+              <w:t xml:space="preserve">Play centers on hand-to-hand or melee combat.</w:t>
             </w:r>
           </w:p>
         </w:tc>
@@ -1548,7 +1548,7 @@
               <w:jc w:val="left"/>
             </w:pPr>
             <w:r>
-              <w:t xml:space="preserve">Shooting at targets with no opponent (code Shooter only if targets stand in for opponents; add a note).</w:t>
+              <w:t xml:space="preserve">Targets with no opponent, unless they stand in for opponents (add a note).</w:t>
             </w:r>
           </w:p>
         </w:tc>
@@ -1589,7 +1589,7 @@
               <w:jc w:val="left"/>
             </w:pPr>
             <w:r>
-              <w:t xml:space="preserve">The player takes on a character role: creates a persona, has a background story, or builds a story by interacting with other characters.</w:t>
+              <w:t xml:space="preserve">The player takes on a character role: a persona, a background story, or a story built with other characters.</w:t>
             </w:r>
           </w:p>
         </w:tc>
@@ -1654,7 +1654,7 @@
               <w:jc w:val="left"/>
             </w:pPr>
             <w:r>
-              <w:t xml:space="preserve">The experience closely imitates a real-world activity or system: driving, flying, working a job, or running a city.</w:t>
+              <w:t xml:space="preserve">The experience imitates a real-world activity or system: driving, working a job, running a city.</w:t>
             </w:r>
           </w:p>
         </w:tc>
@@ -1849,7 +1849,7 @@
               <w:jc w:val="left"/>
             </w:pPr>
             <w:r>
-              <w:t xml:space="preserve">The player competes to move faster or better than others, on foot or in a vehicle.</w:t>
+              <w:t xml:space="preserve">The player races others, on foot or in a vehicle.</w:t>
             </w:r>
           </w:p>
         </w:tc>
@@ -1914,7 +1914,7 @@
               <w:jc w:val="left"/>
             </w:pPr>
             <w:r>
-              <w:t xml:space="preserve">The experience is built around an athletic sport, a team, or a sporting event.</w:t>
+              <w:t xml:space="preserve">Built around an athletic sport, team, or event.</w:t>
             </w:r>
           </w:p>
         </w:tc>
@@ -2056,7 +2056,7 @@
               <w:jc w:val="left"/>
             </w:pPr>
             <w:r>
-              <w:t xml:space="preserve">Opening a locked box by working out its mechanism.</w:t>
+              <w:t xml:space="preserve">Working out a locked box’s mechanism.</w:t>
             </w:r>
           </w:p>
         </w:tc>
@@ -2109,7 +2109,7 @@
               <w:jc w:val="left"/>
             </w:pPr>
             <w:r>
-              <w:t xml:space="preserve">Chance drives the experience: dice, random events, or randomly generated levels.</w:t>
+              <w:t xml:space="preserve">Chance drives play: dice, random events, or generated levels.</w:t>
             </w:r>
           </w:p>
         </w:tc>
@@ -2174,7 +2174,7 @@
               <w:jc w:val="left"/>
             </w:pPr>
             <w:r>
-              <w:t xml:space="preserve">The experience tests the player’s knowledge.</w:t>
+              <w:t xml:space="preserve">Play tests the player’s knowledge.</w:t>
             </w:r>
           </w:p>
         </w:tc>
@@ -2239,7 +2239,7 @@
               <w:jc w:val="left"/>
             </w:pPr>
             <w:r>
-              <w:t xml:space="preserve">The player flies through the environment: an aircraft, a spacecraft, or a creature.</w:t>
+              <w:t xml:space="preserve">The player flies an aircraft, a spacecraft, or a creature.</w:t>
             </w:r>
           </w:p>
         </w:tc>
@@ -2412,39 +2412,7 @@
         <w:pStyle w:val="BodyText"/>
       </w:pPr>
       <w:r>
-        <w:t xml:space="preserve">Simulation became a catch-all. The team debated it in the document’s margins: a</w:t>
-      </w:r>
-      <w:r>
-        <w:t xml:space="preserve"> </w:t>
-      </w:r>
-      <w:r>
-        <w:rPr>
-          <w:i/>
-          <w:iCs/>
-        </w:rPr>
-        <w:t xml:space="preserve">simulator</w:t>
-      </w:r>
-      <w:r>
-        <w:t xml:space="preserve"> </w:t>
-      </w:r>
-      <w:r>
-        <w:t xml:space="preserve">(flying, driving) and a</w:t>
-      </w:r>
-      <w:r>
-        <w:t xml:space="preserve"> </w:t>
-      </w:r>
-      <w:r>
-        <w:rPr>
-          <w:i/>
-          <w:iCs/>
-        </w:rPr>
-        <w:t xml:space="preserve">simulation</w:t>
-      </w:r>
-      <w:r>
-        <w:t xml:space="preserve"> </w:t>
-      </w:r>
-      <w:r>
-        <w:t xml:space="preserve">(running a city or a life) seemed like different genres. The published study kept one Simulation code. In the recorded data, one coder gave Simulation to video players such as YouTube VR, which is why rule G3 exists.</w:t>
+        <w:t xml:space="preserve">Simulation became a catch-all. In the recorded data, one coder gave Simulation to video players such as YouTube VR, which is why rule G3 exists.</w:t>
       </w:r>
     </w:p>
     <w:bookmarkEnd w:id="16"/>
@@ -3387,11 +3355,10 @@
   <w:docDefaults>
     <w:rPrDefault>
       <w:rPr>
-        <w:rFonts w:ascii="Cambria" w:cs="Cambria" w:hAnsi="Cambria"/>
-        <w:color w:val="22262B"/>
+        <w:rFonts w:asciiTheme="minorHAnsi" w:cstheme="minorBidi" w:eastAsiaTheme="minorEastAsia" w:hAnsiTheme="minorHAnsi"/>
         <w:sz w:val="24"/>
         <w:szCs w:val="24"/>
-        <w:lang w:val="en-US"/>
+        <w:lang w:bidi="ar-SA" w:eastAsia="zh-CN" w:val="en-US"/>
       </w:rPr>
     </w:rPrDefault>
     <w:pPrDefault>
@@ -3401,18 +3368,9 @@
     </w:pPrDefault>
   </w:docDefaults>
   <w:latentStyles w:count="276" w:defLockedState="0" w:defQFormat="0" w:defSemiHidden="0" w:defUIPriority="0" w:defUnhideWhenUsed="0"/>
-  <w:style w:styleId="Normal" w:type="paragraph">
+  <w:style w:default="1" w:styleId="Normal" w:type="paragraph">
     <w:name w:val="Normal"/>
     <w:qFormat/>
-    <w:pPr>
-      <w:spacing w:after="160" w:before="0" w:line="276" w:lineRule="auto"/>
-    </w:pPr>
-    <w:rPr>
-      <w:rFonts w:ascii="Cambria" w:cs="Cambria" w:hAnsi="Cambria"/>
-      <w:color w:val="22262B"/>
-      <w:sz w:val="24"/>
-      <w:szCs w:val="24"/>
-    </w:rPr>
   </w:style>
   <w:style w:styleId="BodyText" w:type="paragraph">
     <w:name w:val="Body Text"/>
@@ -3420,46 +3378,40 @@
     <w:link w:val="BodyTextChar"/>
     <w:qFormat/>
     <w:pPr>
-      <w:spacing w:after="160" w:before="0" w:line="276" w:lineRule="auto"/>
+      <w:spacing w:after="180" w:before="180"/>
     </w:pPr>
-    <w:rPr>
-      <w:rFonts w:ascii="Cambria" w:cs="Cambria" w:hAnsi="Cambria"/>
-      <w:color w:val="22262B"/>
-      <w:sz w:val="24"/>
-      <w:szCs w:val="24"/>
-    </w:rPr>
-  </w:style>
-  <w:style w:styleId="FirstParagraph" w:type="paragraph">
+  </w:style>
+  <w:style w:customStyle="1" w:styleId="FirstParagraph" w:type="paragraph">
     <w:name w:val="First Paragraph"/>
     <w:basedOn w:val="BodyText"/>
+    <w:next w:val="BodyText"/>
     <w:qFormat/>
   </w:style>
-  <w:style w:styleId="Compact" w:type="paragraph">
+  <w:style w:customStyle="1" w:styleId="Compact" w:type="paragraph">
     <w:name w:val="Compact"/>
     <w:basedOn w:val="BodyText"/>
     <w:qFormat/>
     <w:pPr>
-      <w:spacing w:after="40" w:before="0" w:line="276" w:lineRule="auto"/>
+      <w:spacing w:after="36" w:before="36"/>
     </w:pPr>
   </w:style>
   <w:style w:styleId="Title" w:type="paragraph">
     <w:name w:val="Title"/>
     <w:basedOn w:val="Normal"/>
-    <w:next w:val="Subtitle"/>
+    <w:next w:val="BodyText"/>
     <w:link w:val="TitleChar"/>
+    <w:uiPriority w:val="10"/>
     <w:qFormat/>
+    <w:rsid w:val="00A10FD9"/>
     <w:pPr>
-      <w:keepNext/>
-      <w:keepLines/>
-      <w:spacing w:after="60" w:before="0"/>
+      <w:spacing w:after="80" w:line="240" w:lineRule="auto"/>
+      <w:contextualSpacing/>
       <w:jc w:val="center"/>
     </w:pPr>
     <w:rPr>
-      <w:rFonts w:ascii="Calibri" w:cs="Calibri" w:hAnsi="Calibri"/>
-      <w:b/>
-      <w:color w:val="1B3A5C"/>
-      <w:sz w:val="28"/>
-      <w:szCs w:val="28"/>
+      <w:rFonts w:asciiTheme="majorHAnsi" w:cstheme="majorBidi" w:eastAsiaTheme="majorEastAsia" w:hAnsiTheme="majorHAnsi"/>
+      <w:sz w:val="56"/>
+      <w:szCs w:val="56"/>
     </w:rPr>
   </w:style>
   <w:style w:customStyle="1" w:styleId="TitleChar" w:type="character">
@@ -3470,28 +3422,28 @@
     <w:rsid w:val="00A10FD9"/>
     <w:rPr>
       <w:rFonts w:asciiTheme="majorHAnsi" w:cstheme="majorBidi" w:eastAsiaTheme="majorEastAsia" w:hAnsiTheme="majorHAnsi"/>
+      <w:sz w:val="56"/>
+      <w:szCs w:val="56"/>
+    </w:rPr>
+  </w:style>
+  <w:style w:styleId="Subtitle" w:type="paragraph">
+    <w:name w:val="Subtitle"/>
+    <w:basedOn w:val="Title"/>
+    <w:next w:val="BodyText"/>
+    <w:link w:val="SubtitleChar"/>
+    <w:uiPriority w:val="11"/>
+    <w:qFormat/>
+    <w:rsid w:val="00A10FD9"/>
+    <w:pPr>
+      <w:numPr>
+        <w:ilvl w:val="1"/>
+      </w:numPr>
+    </w:pPr>
+    <w:rPr>
+      <w:rFonts w:cstheme="majorBidi" w:eastAsiaTheme="majorEastAsia"/>
+      <w:spacing w:val="15"/>
       <w:sz w:val="28"/>
       <w:szCs w:val="28"/>
-    </w:rPr>
-  </w:style>
-  <w:style w:styleId="Subtitle" w:type="paragraph">
-    <w:name w:val="Subtitle"/>
-    <w:basedOn w:val="Normal"/>
-    <w:next w:val="Author"/>
-    <w:link w:val="SubtitleChar"/>
-    <w:qFormat/>
-    <w:pPr>
-      <w:keepNext/>
-      <w:keepLines/>
-      <w:spacing w:after="60" w:before="0"/>
-      <w:jc w:val="center"/>
-    </w:pPr>
-    <w:rPr>
-      <w:rFonts w:ascii="Cambria" w:cs="Cambria" w:hAnsi="Cambria"/>
-      <w:i/>
-      <w:color w:val="595959"/>
-      <w:sz w:val="24"/>
-      <w:szCs w:val="24"/>
     </w:rPr>
   </w:style>
   <w:style w:customStyle="1" w:styleId="SubtitleChar" w:type="character">
@@ -3508,35 +3460,30 @@
       <w:szCs w:val="28"/>
     </w:rPr>
   </w:style>
-  <w:style w:styleId="Author" w:type="paragraph">
+  <w:style w:customStyle="1" w:styleId="Author" w:type="paragraph">
     <w:name w:val="Author"/>
-    <w:basedOn w:val="Normal"/>
-    <w:next w:val="Date"/>
-    <w:qFormat/>
-    <w:pPr>
-      <w:spacing w:after="40" w:before="0"/>
-      <w:jc w:val="center"/>
-    </w:pPr>
-    <w:rPr>
-      <w:rFonts w:ascii="Cambria" w:cs="Cambria" w:hAnsi="Cambria"/>
-      <w:color w:val="22262B"/>
-      <w:sz w:val="24"/>
-      <w:szCs w:val="24"/>
-    </w:rPr>
-  </w:style>
-  <w:style w:styleId="Date" w:type="paragraph">
-    <w:name w:val="Date"/>
-    <w:basedOn w:val="Normal"/>
+    <w:basedOn w:val="Title"/>
     <w:next w:val="BodyText"/>
     <w:qFormat/>
     <w:pPr>
-      <w:spacing w:after="320" w:before="0"/>
-      <w:jc w:val="center"/>
+      <w:keepNext/>
+      <w:keepLines/>
     </w:pPr>
     <w:rPr>
-      <w:rFonts w:ascii="Cambria" w:cs="Cambria" w:hAnsi="Cambria"/>
-      <w:i/>
-      <w:color w:val="595959"/>
+      <w:sz w:val="24"/>
+      <w:szCs w:val="24"/>
+    </w:rPr>
+  </w:style>
+  <w:style w:styleId="Date" w:type="paragraph">
+    <w:name w:val="Date"/>
+    <w:basedOn w:val="Title"/>
+    <w:next w:val="BodyText"/>
+    <w:qFormat/>
+    <w:pPr>
+      <w:keepNext/>
+      <w:keepLines/>
+    </w:pPr>
+    <w:rPr>
       <w:sz w:val="24"/>
       <w:szCs w:val="24"/>
     </w:rPr>
@@ -3554,8 +3501,8 @@
     </w:pPr>
     <w:rPr>
       <w:b/>
-      <w:sz w:val="22"/>
-      <w:szCs w:val="22"/>
+      <w:sz w:val="20"/>
+      <w:szCs w:val="20"/>
     </w:rPr>
   </w:style>
   <w:style w:customStyle="1" w:styleId="Abstract" w:type="paragraph">
@@ -3569,8 +3516,8 @@
       <w:spacing w:after="300" w:before="100"/>
     </w:pPr>
     <w:rPr>
-      <w:sz w:val="22"/>
-      <w:szCs w:val="22"/>
+      <w:sz w:val="20"/>
+      <w:szCs w:val="20"/>
     </w:rPr>
   </w:style>
   <w:style w:styleId="Bibliography" w:type="paragraph">
@@ -3586,24 +3533,20 @@
     <w:basedOn w:val="Normal"/>
     <w:next w:val="BodyText"/>
     <w:link w:val="Heading1Char"/>
+    <w:uiPriority w:val="9"/>
     <w:qFormat/>
+    <w:rsid w:val="00A10FD9"/>
     <w:pPr>
       <w:keepNext/>
       <w:keepLines/>
-      <w:spacing w:after="100" w:before="320"/>
-      <w:pBdr>
-        <w:bottom w:color="1B3A5C" w:space="4" w:sz="6" w:val="single"/>
-      </w:pBdr>
+      <w:spacing w:after="80" w:before="360"/>
       <w:outlineLvl w:val="0"/>
     </w:pPr>
     <w:rPr>
-      <w:rFonts w:ascii="Calibri" w:cs="Calibri" w:hAnsi="Calibri"/>
-      <w:b/>
-      <w:smallCaps/>
-      <w:color w:val="1B3A5C"/>
-      <w:spacing w:val="10"/>
-      <w:sz w:val="26"/>
-      <w:szCs w:val="26"/>
+      <w:rFonts w:asciiTheme="majorHAnsi" w:cstheme="majorBidi" w:eastAsiaTheme="majorEastAsia" w:hAnsiTheme="majorHAnsi"/>
+      <w:color w:themeColor="accent1" w:themeShade="BF" w:val="0F4761"/>
+      <w:sz w:val="40"/>
+      <w:szCs w:val="40"/>
     </w:rPr>
   </w:style>
   <w:style w:styleId="Heading2" w:type="paragraph">
@@ -3611,19 +3554,22 @@
     <w:basedOn w:val="Normal"/>
     <w:next w:val="BodyText"/>
     <w:link w:val="Heading2Char"/>
+    <w:uiPriority w:val="9"/>
+    <w:semiHidden/>
+    <w:unhideWhenUsed/>
     <w:qFormat/>
+    <w:rsid w:val="00A10FD9"/>
     <w:pPr>
       <w:keepNext/>
       <w:keepLines/>
-      <w:spacing w:after="80" w:before="260"/>
+      <w:spacing w:after="80" w:before="160"/>
       <w:outlineLvl w:val="1"/>
     </w:pPr>
     <w:rPr>
-      <w:rFonts w:ascii="Calibri" w:cs="Calibri" w:hAnsi="Calibri"/>
-      <w:b/>
-      <w:color w:val="1B3A5C"/>
-      <w:sz w:val="24"/>
-      <w:szCs w:val="24"/>
+      <w:rFonts w:asciiTheme="majorHAnsi" w:cstheme="majorBidi" w:eastAsiaTheme="majorEastAsia" w:hAnsiTheme="majorHAnsi"/>
+      <w:color w:themeColor="accent1" w:themeShade="BF" w:val="0F4761"/>
+      <w:sz w:val="32"/>
+      <w:szCs w:val="32"/>
     </w:rPr>
   </w:style>
   <w:style w:styleId="Heading3" w:type="paragraph">
@@ -3631,20 +3577,22 @@
     <w:basedOn w:val="Normal"/>
     <w:next w:val="BodyText"/>
     <w:link w:val="Heading3Char"/>
+    <w:uiPriority w:val="9"/>
+    <w:semiHidden/>
+    <w:unhideWhenUsed/>
     <w:qFormat/>
+    <w:rsid w:val="00A10FD9"/>
     <w:pPr>
       <w:keepNext/>
       <w:keepLines/>
-      <w:spacing w:after="60" w:before="220"/>
+      <w:spacing w:after="80" w:before="160"/>
       <w:outlineLvl w:val="2"/>
     </w:pPr>
     <w:rPr>
-      <w:rFonts w:ascii="Calibri" w:cs="Calibri" w:hAnsi="Calibri"/>
-      <w:b/>
-      <w:i/>
-      <w:color w:val="15605C"/>
-      <w:sz w:val="24"/>
-      <w:szCs w:val="24"/>
+      <w:rFonts w:cstheme="majorBidi" w:eastAsiaTheme="majorEastAsia"/>
+      <w:color w:themeColor="accent1" w:themeShade="BF" w:val="0F4761"/>
+      <w:sz w:val="28"/>
+      <w:szCs w:val="28"/>
     </w:rPr>
   </w:style>
   <w:style w:styleId="Heading4" w:type="paragraph">
@@ -3652,19 +3600,22 @@
     <w:basedOn w:val="Normal"/>
     <w:next w:val="BodyText"/>
     <w:link w:val="Heading4Char"/>
+    <w:uiPriority w:val="9"/>
+    <w:semiHidden/>
+    <w:unhideWhenUsed/>
     <w:qFormat/>
+    <w:rsid w:val="00A10FD9"/>
     <w:pPr>
       <w:keepNext/>
       <w:keepLines/>
-      <w:spacing w:after="40" w:before="200"/>
+      <w:spacing w:after="40" w:before="80"/>
       <w:outlineLvl w:val="3"/>
     </w:pPr>
     <w:rPr>
-      <w:rFonts w:ascii="Cambria" w:cs="Cambria" w:hAnsi="Cambria"/>
-      <w:b/>
-      <w:color w:val="22262B"/>
-      <w:sz w:val="24"/>
-      <w:szCs w:val="24"/>
+      <w:rFonts w:cstheme="majorBidi" w:eastAsiaTheme="majorEastAsia"/>
+      <w:i/>
+      <w:iCs/>
+      <w:color w:themeColor="accent1" w:themeShade="BF" w:val="0F4761"/>
     </w:rPr>
   </w:style>
   <w:style w:styleId="Heading5" w:type="paragraph">
@@ -3672,19 +3623,20 @@
     <w:basedOn w:val="Normal"/>
     <w:next w:val="BodyText"/>
     <w:link w:val="Heading5Char"/>
+    <w:uiPriority w:val="9"/>
+    <w:semiHidden/>
+    <w:unhideWhenUsed/>
     <w:qFormat/>
+    <w:rsid w:val="00A10FD9"/>
     <w:pPr>
       <w:keepNext/>
       <w:keepLines/>
-      <w:spacing w:after="40" w:before="180"/>
+      <w:spacing w:after="40" w:before="80"/>
       <w:outlineLvl w:val="4"/>
     </w:pPr>
     <w:rPr>
-      <w:rFonts w:ascii="Cambria" w:cs="Cambria" w:hAnsi="Cambria"/>
-      <w:i/>
-      <w:color w:val="22262B"/>
-      <w:sz w:val="24"/>
-      <w:szCs w:val="24"/>
+      <w:rFonts w:cstheme="majorBidi" w:eastAsiaTheme="majorEastAsia"/>
+      <w:color w:themeColor="accent1" w:themeShade="BF" w:val="0F4761"/>
     </w:rPr>
   </w:style>
   <w:style w:styleId="Heading6" w:type="paragraph">
@@ -3692,19 +3644,22 @@
     <w:basedOn w:val="Normal"/>
     <w:next w:val="BodyText"/>
     <w:link w:val="Heading6Char"/>
+    <w:uiPriority w:val="9"/>
+    <w:semiHidden/>
+    <w:unhideWhenUsed/>
     <w:qFormat/>
+    <w:rsid w:val="00A10FD9"/>
     <w:pPr>
       <w:keepNext/>
       <w:keepLines/>
-      <w:spacing w:after="40" w:before="160"/>
+      <w:spacing w:after="0" w:before="40"/>
       <w:outlineLvl w:val="5"/>
     </w:pPr>
     <w:rPr>
-      <w:rFonts w:ascii="Cambria" w:cs="Cambria" w:hAnsi="Cambria"/>
+      <w:rFonts w:cstheme="majorBidi" w:eastAsiaTheme="majorEastAsia"/>
       <w:i/>
-      <w:color w:val="595959"/>
-      <w:sz w:val="24"/>
-      <w:szCs w:val="24"/>
+      <w:iCs/>
+      <w:color w:themeColor="text1" w:themeTint="A6" w:val="595959"/>
     </w:rPr>
   </w:style>
   <w:style w:styleId="Heading7" w:type="paragraph">
@@ -3781,8 +3736,8 @@
     <w:rPr>
       <w:rFonts w:asciiTheme="majorHAnsi" w:cstheme="majorBidi" w:eastAsiaTheme="majorEastAsia" w:hAnsiTheme="majorHAnsi"/>
       <w:color w:themeColor="accent1" w:themeShade="BF" w:val="0F4761"/>
-      <w:sz w:val="28"/>
-      <w:szCs w:val="28"/>
+      <w:sz w:val="40"/>
+      <w:szCs w:val="40"/>
     </w:rPr>
   </w:style>
   <w:style w:customStyle="1" w:styleId="Heading2Char" w:type="character">
@@ -3795,8 +3750,8 @@
     <w:rPr>
       <w:rFonts w:asciiTheme="majorHAnsi" w:cstheme="majorBidi" w:eastAsiaTheme="majorEastAsia" w:hAnsiTheme="majorHAnsi"/>
       <w:color w:themeColor="accent1" w:themeShade="BF" w:val="0F4761"/>
-      <w:sz w:val="28"/>
-      <w:szCs w:val="28"/>
+      <w:sz w:val="32"/>
+      <w:szCs w:val="32"/>
     </w:rPr>
   </w:style>
   <w:style w:customStyle="1" w:styleId="Heading3Char" w:type="character">
@@ -3893,22 +3848,15 @@
   </w:style>
   <w:style w:styleId="BlockText" w:type="paragraph">
     <w:name w:val="Block Text"/>
-    <w:basedOn w:val="Normal"/>
+    <w:basedOn w:val="BodyText"/>
+    <w:next w:val="BodyText"/>
+    <w:uiPriority w:val="9"/>
+    <w:unhideWhenUsed/>
     <w:qFormat/>
     <w:pPr>
-      <w:spacing w:after="120" w:before="120"/>
-      <w:ind w:left="360" w:right="360"/>
-      <w:pBdr>
-        <w:left w:color="15605C" w:space="10" w:sz="12" w:val="single"/>
-      </w:pBdr>
+      <w:spacing w:after="100" w:before="100"/>
+      <w:ind w:firstLine="0" w:left="480" w:right="480"/>
     </w:pPr>
-    <w:rPr>
-      <w:rFonts w:ascii="Cambria" w:cs="Cambria" w:hAnsi="Cambria"/>
-      <w:i/>
-      <w:color w:val="22262B"/>
-      <w:sz w:val="24"/>
-      <w:szCs w:val="24"/>
-    </w:rPr>
   </w:style>
   <w:style w:styleId="FootnoteText" w:type="paragraph">
     <w:name w:val="Footnote Text"/>
@@ -3979,17 +3927,12 @@
   <w:style w:styleId="Caption" w:type="paragraph">
     <w:name w:val="Caption"/>
     <w:basedOn w:val="Normal"/>
-    <w:next w:val="BodyText"/>
-    <w:qFormat/>
+    <w:link w:val="BodyTextChar"/>
     <w:pPr>
-      <w:spacing w:after="160" w:before="80"/>
+      <w:spacing w:after="120" w:before="0"/>
     </w:pPr>
     <w:rPr>
-      <w:rFonts w:ascii="Cambria" w:cs="Cambria" w:hAnsi="Cambria"/>
       <w:i/>
-      <w:color w:val="595959"/>
-      <w:sz w:val="24"/>
-      <w:szCs w:val="24"/>
     </w:rPr>
   </w:style>
   <w:style w:customStyle="1" w:styleId="TableCaption" w:type="paragraph">
@@ -4019,14 +3962,12 @@
     <w:basedOn w:val="DefaultParagraphFont"/>
     <w:link w:val="BodyText"/>
   </w:style>
-  <w:style w:styleId="VerbatimChar" w:type="character">
+  <w:style w:customStyle="1" w:styleId="VerbatimChar" w:type="character">
     <w:name w:val="Verbatim Char"/>
-    <w:qFormat/>
-    <w:rPr>
-      <w:rFonts w:ascii="Consolas" w:cs="Consolas" w:hAnsi="Consolas"/>
-      <w:color w:val="22262B"/>
+    <w:basedOn w:val="BodyTextChar"/>
+    <w:rPr>
+      <w:rFonts w:ascii="Consolas" w:hAnsi="Consolas"/>
       <w:sz w:val="22"/>
-      <w:szCs w:val="22"/>
     </w:rPr>
   </w:style>
   <w:style w:customStyle="1" w:styleId="SectionNumber" w:type="character">
@@ -4065,7 +4006,7 @@
       <w:color w:themeColor="accent1" w:themeShade="BF" w:val="365F91"/>
     </w:rPr>
   </w:style>
-  <w:style w:customStyle="1" w:styleId="SourceCode" w:type="paragraph">
+  <w:style w:type="paragraph" w:customStyle="1" w:styleId="SourceCode">
     <w:name w:val="Source Code"/>
     <w:basedOn w:val="Normal"/>
     <w:link w:val="VerbatimChar"/>
@@ -4073,7 +4014,7 @@
       <w:wordWrap w:val="off"/>
     </w:pPr>
   </w:style>
-  <w:style w:customStyle="1" w:styleId="KeywordTok" w:type="character">
+  <w:style w:type="character" w:customStyle="1" w:styleId="KeywordTok">
     <w:name w:val="KeywordTok"/>
     <w:basedOn w:val="VerbatimChar"/>
     <w:rPr>
@@ -4081,77 +4022,77 @@
       <w:color w:val="007020"/>
     </w:rPr>
   </w:style>
-  <w:style w:customStyle="1" w:styleId="DataTypeTok" w:type="character">
+  <w:style w:type="character" w:customStyle="1" w:styleId="DataTypeTok">
     <w:name w:val="DataTypeTok"/>
     <w:basedOn w:val="VerbatimChar"/>
     <w:rPr>
       <w:color w:val="902000"/>
     </w:rPr>
   </w:style>
-  <w:style w:customStyle="1" w:styleId="DecValTok" w:type="character">
+  <w:style w:type="character" w:customStyle="1" w:styleId="DecValTok">
     <w:name w:val="DecValTok"/>
     <w:basedOn w:val="VerbatimChar"/>
     <w:rPr>
       <w:color w:val="40a070"/>
     </w:rPr>
   </w:style>
-  <w:style w:customStyle="1" w:styleId="BaseNTok" w:type="character">
+  <w:style w:type="character" w:customStyle="1" w:styleId="BaseNTok">
     <w:name w:val="BaseNTok"/>
     <w:basedOn w:val="VerbatimChar"/>
     <w:rPr>
       <w:color w:val="40a070"/>
     </w:rPr>
   </w:style>
-  <w:style w:customStyle="1" w:styleId="FloatTok" w:type="character">
+  <w:style w:type="character" w:customStyle="1" w:styleId="FloatTok">
     <w:name w:val="FloatTok"/>
     <w:basedOn w:val="VerbatimChar"/>
     <w:rPr>
       <w:color w:val="40a070"/>
     </w:rPr>
   </w:style>
-  <w:style w:customStyle="1" w:styleId="ConstantTok" w:type="character">
+  <w:style w:type="character" w:customStyle="1" w:styleId="ConstantTok">
     <w:name w:val="ConstantTok"/>
     <w:basedOn w:val="VerbatimChar"/>
     <w:rPr>
       <w:color w:val="880000"/>
     </w:rPr>
   </w:style>
-  <w:style w:customStyle="1" w:styleId="CharTok" w:type="character">
+  <w:style w:type="character" w:customStyle="1" w:styleId="CharTok">
     <w:name w:val="CharTok"/>
     <w:basedOn w:val="VerbatimChar"/>
     <w:rPr>
       <w:color w:val="4070a0"/>
     </w:rPr>
   </w:style>
-  <w:style w:customStyle="1" w:styleId="SpecialCharTok" w:type="character">
+  <w:style w:type="character" w:customStyle="1" w:styleId="SpecialCharTok">
     <w:name w:val="SpecialCharTok"/>
     <w:basedOn w:val="VerbatimChar"/>
     <w:rPr>
       <w:color w:val="4070a0"/>
     </w:rPr>
   </w:style>
-  <w:style w:customStyle="1" w:styleId="StringTok" w:type="character">
+  <w:style w:type="character" w:customStyle="1" w:styleId="StringTok">
     <w:name w:val="StringTok"/>
     <w:basedOn w:val="VerbatimChar"/>
     <w:rPr>
       <w:color w:val="4070a0"/>
     </w:rPr>
   </w:style>
-  <w:style w:customStyle="1" w:styleId="VerbatimStringTok" w:type="character">
+  <w:style w:type="character" w:customStyle="1" w:styleId="VerbatimStringTok">
     <w:name w:val="VerbatimStringTok"/>
     <w:basedOn w:val="VerbatimChar"/>
     <w:rPr>
       <w:color w:val="4070a0"/>
     </w:rPr>
   </w:style>
-  <w:style w:customStyle="1" w:styleId="SpecialStringTok" w:type="character">
+  <w:style w:type="character" w:customStyle="1" w:styleId="SpecialStringTok">
     <w:name w:val="SpecialStringTok"/>
     <w:basedOn w:val="VerbatimChar"/>
     <w:rPr>
       <w:color w:val="bb6688"/>
     </w:rPr>
   </w:style>
-  <w:style w:customStyle="1" w:styleId="ImportTok" w:type="character">
+  <w:style w:type="character" w:customStyle="1" w:styleId="ImportTok">
     <w:name w:val="ImportTok"/>
     <w:basedOn w:val="VerbatimChar"/>
     <w:rPr>
@@ -4159,7 +4100,7 @@
       <w:color w:val="008000"/>
     </w:rPr>
   </w:style>
-  <w:style w:customStyle="1" w:styleId="CommentTok" w:type="character">
+  <w:style w:type="character" w:customStyle="1" w:styleId="CommentTok">
     <w:name w:val="CommentTok"/>
     <w:basedOn w:val="VerbatimChar"/>
     <w:rPr>
@@ -4167,7 +4108,7 @@
       <w:color w:val="60a0b0"/>
     </w:rPr>
   </w:style>
-  <w:style w:customStyle="1" w:styleId="DocumentationTok" w:type="character">
+  <w:style w:type="character" w:customStyle="1" w:styleId="DocumentationTok">
     <w:name w:val="DocumentationTok"/>
     <w:basedOn w:val="VerbatimChar"/>
     <w:rPr>
@@ -4175,7 +4116,7 @@
       <w:color w:val="ba2121"/>
     </w:rPr>
   </w:style>
-  <w:style w:customStyle="1" w:styleId="AnnotationTok" w:type="character">
+  <w:style w:type="character" w:customStyle="1" w:styleId="AnnotationTok">
     <w:name w:val="AnnotationTok"/>
     <w:basedOn w:val="VerbatimChar"/>
     <w:rPr>
@@ -4184,7 +4125,7 @@
       <w:color w:val="60a0b0"/>
     </w:rPr>
   </w:style>
-  <w:style w:customStyle="1" w:styleId="CommentVarTok" w:type="character">
+  <w:style w:type="character" w:customStyle="1" w:styleId="CommentVarTok">
     <w:name w:val="CommentVarTok"/>
     <w:basedOn w:val="VerbatimChar"/>
     <w:rPr>
@@ -4193,28 +4134,28 @@
       <w:color w:val="60a0b0"/>
     </w:rPr>
   </w:style>
-  <w:style w:customStyle="1" w:styleId="OtherTok" w:type="character">
+  <w:style w:type="character" w:customStyle="1" w:styleId="OtherTok">
     <w:name w:val="OtherTok"/>
     <w:basedOn w:val="VerbatimChar"/>
     <w:rPr>
       <w:color w:val="007020"/>
     </w:rPr>
   </w:style>
-  <w:style w:customStyle="1" w:styleId="FunctionTok" w:type="character">
+  <w:style w:type="character" w:customStyle="1" w:styleId="FunctionTok">
     <w:name w:val="FunctionTok"/>
     <w:basedOn w:val="VerbatimChar"/>
     <w:rPr>
       <w:color w:val="06287e"/>
     </w:rPr>
   </w:style>
-  <w:style w:customStyle="1" w:styleId="VariableTok" w:type="character">
+  <w:style w:type="character" w:customStyle="1" w:styleId="VariableTok">
     <w:name w:val="VariableTok"/>
     <w:basedOn w:val="VerbatimChar"/>
     <w:rPr>
       <w:color w:val="19177c"/>
     </w:rPr>
   </w:style>
-  <w:style w:customStyle="1" w:styleId="ControlFlowTok" w:type="character">
+  <w:style w:type="character" w:customStyle="1" w:styleId="ControlFlowTok">
     <w:name w:val="ControlFlowTok"/>
     <w:basedOn w:val="VerbatimChar"/>
     <w:rPr>
@@ -4222,45 +4163,45 @@
       <w:color w:val="007020"/>
     </w:rPr>
   </w:style>
-  <w:style w:customStyle="1" w:styleId="OperatorTok" w:type="character">
+  <w:style w:type="character" w:customStyle="1" w:styleId="OperatorTok">
     <w:name w:val="OperatorTok"/>
     <w:basedOn w:val="VerbatimChar"/>
     <w:rPr>
       <w:color w:val="666666"/>
     </w:rPr>
   </w:style>
-  <w:style w:customStyle="1" w:styleId="BuiltInTok" w:type="character">
+  <w:style w:type="character" w:customStyle="1" w:styleId="BuiltInTok">
     <w:name w:val="BuiltInTok"/>
     <w:basedOn w:val="VerbatimChar"/>
     <w:rPr>
       <w:color w:val="008000"/>
     </w:rPr>
   </w:style>
-  <w:style w:customStyle="1" w:styleId="ExtensionTok" w:type="character">
+  <w:style w:type="character" w:customStyle="1" w:styleId="ExtensionTok">
     <w:name w:val="ExtensionTok"/>
     <w:basedOn w:val="VerbatimChar"/>
     <w:rPr/>
   </w:style>
-  <w:style w:customStyle="1" w:styleId="PreprocessorTok" w:type="character">
+  <w:style w:type="character" w:customStyle="1" w:styleId="PreprocessorTok">
     <w:name w:val="PreprocessorTok"/>
     <w:basedOn w:val="VerbatimChar"/>
     <w:rPr>
       <w:color w:val="bc7a00"/>
     </w:rPr>
   </w:style>
-  <w:style w:customStyle="1" w:styleId="AttributeTok" w:type="character">
+  <w:style w:type="character" w:customStyle="1" w:styleId="AttributeTok">
     <w:name w:val="AttributeTok"/>
     <w:basedOn w:val="VerbatimChar"/>
     <w:rPr>
       <w:color w:val="7d9029"/>
     </w:rPr>
   </w:style>
-  <w:style w:customStyle="1" w:styleId="RegionMarkerTok" w:type="character">
+  <w:style w:type="character" w:customStyle="1" w:styleId="RegionMarkerTok">
     <w:name w:val="RegionMarkerTok"/>
     <w:basedOn w:val="VerbatimChar"/>
     <w:rPr/>
   </w:style>
-  <w:style w:customStyle="1" w:styleId="InformationTok" w:type="character">
+  <w:style w:type="character" w:customStyle="1" w:styleId="InformationTok">
     <w:name w:val="InformationTok"/>
     <w:basedOn w:val="VerbatimChar"/>
     <w:rPr>
@@ -4269,7 +4210,7 @@
       <w:color w:val="60a0b0"/>
     </w:rPr>
   </w:style>
-  <w:style w:customStyle="1" w:styleId="WarningTok" w:type="character">
+  <w:style w:type="character" w:customStyle="1" w:styleId="WarningTok">
     <w:name w:val="WarningTok"/>
     <w:basedOn w:val="VerbatimChar"/>
     <w:rPr>
@@ -4278,7 +4219,7 @@
       <w:color w:val="60a0b0"/>
     </w:rPr>
   </w:style>
-  <w:style w:customStyle="1" w:styleId="AlertTok" w:type="character">
+  <w:style w:type="character" w:customStyle="1" w:styleId="AlertTok">
     <w:name w:val="AlertTok"/>
     <w:basedOn w:val="VerbatimChar"/>
     <w:rPr>
@@ -4286,7 +4227,7 @@
       <w:color w:val="ff0000"/>
     </w:rPr>
   </w:style>
-  <w:style w:customStyle="1" w:styleId="ErrorTok" w:type="character">
+  <w:style w:type="character" w:customStyle="1" w:styleId="ErrorTok">
     <w:name w:val="ErrorTok"/>
     <w:basedOn w:val="VerbatimChar"/>
     <w:rPr>
@@ -4294,7 +4235,7 @@
       <w:color w:val="ff0000"/>
     </w:rPr>
   </w:style>
-  <w:style w:customStyle="1" w:styleId="NormalTok" w:type="character">
+  <w:style w:type="character" w:customStyle="1" w:styleId="NormalTok">
     <w:name w:val="NormalTok"/>
     <w:basedOn w:val="VerbatimChar"/>
     <w:rPr/>

</xml_diff>